<commit_message>
Format Tools in Power BI
</commit_message>
<xml_diff>
--- a/06_MS_Power_BI/Power BI Topics/Topics.docx
+++ b/06_MS_Power_BI/Power BI Topics/Topics.docx
@@ -10,6 +10,11 @@
     <w:p>
       <w:r>
         <w:t>Text Function Using DAX</w:t>
+      </w:r>
+    </w:p>
+    <w:p>
+      <w:r>
+        <w:t>Format Tools in Power BI</w:t>
       </w:r>
     </w:p>
     <w:sectPr>

</xml_diff>

<commit_message>
Dealing with Text Tools
</commit_message>
<xml_diff>
--- a/06_MS_Power_BI/Power BI Topics/Topics.docx
+++ b/06_MS_Power_BI/Power BI Topics/Topics.docx
@@ -15,6 +15,11 @@
     <w:p>
       <w:r>
         <w:t>Format Tools in Power BI</w:t>
+      </w:r>
+    </w:p>
+    <w:p>
+      <w:r>
+        <w:t>Dealing with Text Tools</w:t>
       </w:r>
     </w:p>
     <w:sectPr>

</xml_diff>

<commit_message>
Creating Tables in Power BI
</commit_message>
<xml_diff>
--- a/06_MS_Power_BI/Power BI Topics/Topics.docx
+++ b/06_MS_Power_BI/Power BI Topics/Topics.docx
@@ -20,6 +20,16 @@
     <w:p>
       <w:r>
         <w:t>Dealing with Text Tools</w:t>
+      </w:r>
+    </w:p>
+    <w:p>
+      <w:r>
+        <w:t>Dealing with Numerical Tools</w:t>
+      </w:r>
+    </w:p>
+    <w:p>
+      <w:r>
+        <w:t>Create Table using Power BI</w:t>
       </w:r>
     </w:p>
     <w:sectPr>

</xml_diff>

<commit_message>
Dealing with Date and Time
</commit_message>
<xml_diff>
--- a/06_MS_Power_BI/Power BI Topics/Topics.docx
+++ b/06_MS_Power_BI/Power BI Topics/Topics.docx
@@ -30,6 +30,11 @@
     <w:p>
       <w:r>
         <w:t>Create Table using Power BI</w:t>
+      </w:r>
+    </w:p>
+    <w:p>
+      <w:r>
+        <w:t>Dealing with Date and Time</w:t>
       </w:r>
     </w:p>
     <w:sectPr>

</xml_diff>

<commit_message>
Pivoting and Unpivoting of Data
</commit_message>
<xml_diff>
--- a/06_MS_Power_BI/Power BI Topics/Topics.docx
+++ b/06_MS_Power_BI/Power BI Topics/Topics.docx
@@ -35,6 +35,11 @@
     <w:p>
       <w:r>
         <w:t>Dealing with Date and Time</w:t>
+      </w:r>
+    </w:p>
+    <w:p>
+      <w:r>
+        <w:t>Pivoting and Unpivoting of Data</w:t>
       </w:r>
     </w:p>
     <w:sectPr>

</xml_diff>

<commit_message>
Adding Conditional Columns in Power BI
</commit_message>
<xml_diff>
--- a/06_MS_Power_BI/Power BI Topics/Topics.docx
+++ b/06_MS_Power_BI/Power BI Topics/Topics.docx
@@ -40,6 +40,11 @@
     <w:p>
       <w:r>
         <w:t>Pivoting and Unpivoting of Data</w:t>
+      </w:r>
+    </w:p>
+    <w:p>
+      <w:r>
+        <w:t>Adding Conditional Columns</w:t>
       </w:r>
     </w:p>
     <w:sectPr>

</xml_diff>

<commit_message>
Merge Queries and Append Queries
</commit_message>
<xml_diff>
--- a/06_MS_Power_BI/Power BI Topics/Topics.docx
+++ b/06_MS_Power_BI/Power BI Topics/Topics.docx
@@ -45,6 +45,11 @@
     <w:p>
       <w:r>
         <w:t>Adding Conditional Columns</w:t>
+      </w:r>
+    </w:p>
+    <w:p>
+      <w:r>
+        <w:t>Merge Queries and Append Queries</w:t>
       </w:r>
     </w:p>
     <w:sectPr>

</xml_diff>

<commit_message>
Cardinality and Cross filter Direction
</commit_message>
<xml_diff>
--- a/06_MS_Power_BI/Power BI Topics/Topics.docx
+++ b/06_MS_Power_BI/Power BI Topics/Topics.docx
@@ -65,6 +65,11 @@
     <w:p>
       <w:r>
         <w:t>Editing data relationship</w:t>
+      </w:r>
+    </w:p>
+    <w:p>
+      <w:r>
+        <w:t>Cardinality and Cross Filter Direction</w:t>
       </w:r>
     </w:p>
     <w:sectPr>

</xml_diff>

<commit_message>
Date and Time Function in Dax
</commit_message>
<xml_diff>
--- a/06_MS_Power_BI/Power BI Topics/Topics.docx
+++ b/06_MS_Power_BI/Power BI Topics/Topics.docx
@@ -100,6 +100,11 @@
     <w:p>
       <w:r>
         <w:t>Functions DAX</w:t>
+      </w:r>
+    </w:p>
+    <w:p>
+      <w:r>
+        <w:t>Date and Time Function in Dax</w:t>
       </w:r>
     </w:p>
     <w:sectPr>

</xml_diff>

<commit_message>
Logical Functions Using DAX
</commit_message>
<xml_diff>
--- a/06_MS_Power_BI/Power BI Topics/Topics.docx
+++ b/06_MS_Power_BI/Power BI Topics/Topics.docx
@@ -105,6 +105,16 @@
     <w:p>
       <w:r>
         <w:t>Date and Time Function in Dax</w:t>
+      </w:r>
+    </w:p>
+    <w:p>
+      <w:r>
+        <w:t>Text Functions in DAX</w:t>
+      </w:r>
+    </w:p>
+    <w:p>
+      <w:r>
+        <w:t>Logical Functions Using DAX</w:t>
       </w:r>
     </w:p>
     <w:sectPr>

</xml_diff>

<commit_message>
Visualization in Power BI
</commit_message>
<xml_diff>
--- a/06_MS_Power_BI/Power BI Topics/Topics.docx
+++ b/06_MS_Power_BI/Power BI Topics/Topics.docx
@@ -120,6 +120,11 @@
     <w:p>
       <w:r>
         <w:t>DAX Operators</w:t>
+      </w:r>
+    </w:p>
+    <w:p>
+      <w:r>
+        <w:t>Visualization in Power BI</w:t>
       </w:r>
     </w:p>
     <w:sectPr>

</xml_diff>

<commit_message>
Filtering Options in Power BI
</commit_message>
<xml_diff>
--- a/06_MS_Power_BI/Power BI Topics/Topics.docx
+++ b/06_MS_Power_BI/Power BI Topics/Topics.docx
@@ -125,6 +125,16 @@
     <w:p>
       <w:r>
         <w:t>Visualization in Power BI</w:t>
+      </w:r>
+    </w:p>
+    <w:p>
+      <w:r>
+        <w:t>Visualization Charts in Power BI</w:t>
+      </w:r>
+    </w:p>
+    <w:p>
+      <w:r>
+        <w:t>Filtering Options in Power BI</w:t>
       </w:r>
     </w:p>
     <w:sectPr>

</xml_diff>

<commit_message>
Charts in Power BI
</commit_message>
<xml_diff>
--- a/06_MS_Power_BI/Power BI Topics/Topics.docx
+++ b/06_MS_Power_BI/Power BI Topics/Topics.docx
@@ -135,6 +135,11 @@
     <w:p>
       <w:r>
         <w:t>Filtering Options in Power BI</w:t>
+      </w:r>
+    </w:p>
+    <w:p>
+      <w:r>
+        <w:t>Charts in Power BI</w:t>
       </w:r>
     </w:p>
     <w:sectPr>

</xml_diff>

<commit_message>
Filtering Data with Slicer
</commit_message>
<xml_diff>
--- a/06_MS_Power_BI/Power BI Topics/Topics.docx
+++ b/06_MS_Power_BI/Power BI Topics/Topics.docx
@@ -140,6 +140,12 @@
     <w:p>
       <w:r>
         <w:t>Charts in Power BI</w:t>
+      </w:r>
+    </w:p>
+    <w:p>
+      <w:r>
+        <w:lastRenderedPageBreak/>
+        <w:t>Filtering Data with Slicer</w:t>
       </w:r>
     </w:p>
     <w:sectPr>

</xml_diff>

<commit_message>
Number Cards and Text Cards
</commit_message>
<xml_diff>
--- a/06_MS_Power_BI/Power BI Topics/Topics.docx
+++ b/06_MS_Power_BI/Power BI Topics/Topics.docx
@@ -146,6 +146,11 @@
       <w:r>
         <w:lastRenderedPageBreak/>
         <w:t>Filtering Data with Slicer</w:t>
+      </w:r>
+    </w:p>
+    <w:p>
+      <w:r>
+        <w:t>Number Cards and Text Cards</w:t>
       </w:r>
     </w:p>
     <w:sectPr>

</xml_diff>

<commit_message>
Modifying Colours in Charts and Visuals
</commit_message>
<xml_diff>
--- a/06_MS_Power_BI/Power BI Topics/Topics.docx
+++ b/06_MS_Power_BI/Power BI Topics/Topics.docx
@@ -156,6 +156,11 @@
     <w:p>
       <w:r>
         <w:t>KPI Visuals</w:t>
+      </w:r>
+    </w:p>
+    <w:p>
+      <w:r>
+        <w:t>Modifying Colours in Charts and Visuals</w:t>
       </w:r>
     </w:p>
     <w:sectPr>

</xml_diff>

<commit_message>
Visualizing Data with Maps
</commit_message>
<xml_diff>
--- a/06_MS_Power_BI/Power BI Topics/Topics.docx
+++ b/06_MS_Power_BI/Power BI Topics/Topics.docx
@@ -161,6 +161,11 @@
     <w:p>
       <w:r>
         <w:t>Modifying Colours in Charts and Visuals</w:t>
+      </w:r>
+    </w:p>
+    <w:p>
+      <w:r>
+        <w:t>Visualizing Data with Maps</w:t>
       </w:r>
     </w:p>
     <w:sectPr>

</xml_diff>

<commit_message>
Tree Map in Power BI
</commit_message>
<xml_diff>
--- a/06_MS_Power_BI/Power BI Topics/Topics.docx
+++ b/06_MS_Power_BI/Power BI Topics/Topics.docx
@@ -166,6 +166,11 @@
     <w:p>
       <w:r>
         <w:t>Visualizing Data with Maps</w:t>
+      </w:r>
+    </w:p>
+    <w:p>
+      <w:r>
+        <w:t>Tree Map in Power BI</w:t>
       </w:r>
     </w:p>
     <w:sectPr>

</xml_diff>

<commit_message>
Bookmarks and Buttons in Power BI
</commit_message>
<xml_diff>
--- a/06_MS_Power_BI/Power BI Topics/Topics.docx
+++ b/06_MS_Power_BI/Power BI Topics/Topics.docx
@@ -171,6 +171,11 @@
     <w:p>
       <w:r>
         <w:t>Tree Map in Power BI</w:t>
+      </w:r>
+    </w:p>
+    <w:p>
+      <w:r>
+        <w:t>Bookmarks and Buttons in Power BI</w:t>
       </w:r>
     </w:p>
     <w:sectPr>

</xml_diff>

<commit_message>
Customs Visuals in Power BI
</commit_message>
<xml_diff>
--- a/06_MS_Power_BI/Power BI Topics/Topics.docx
+++ b/06_MS_Power_BI/Power BI Topics/Topics.docx
@@ -176,6 +176,11 @@
     <w:p>
       <w:r>
         <w:t>Bookmarks and Buttons in Power BI</w:t>
+      </w:r>
+    </w:p>
+    <w:p>
+      <w:r>
+        <w:t>Customs Visuals in Power BI</w:t>
       </w:r>
     </w:p>
     <w:sectPr>

</xml_diff>

<commit_message>
Publish Dashboard in Power BI
</commit_message>
<xml_diff>
--- a/06_MS_Power_BI/Power BI Topics/Topics.docx
+++ b/06_MS_Power_BI/Power BI Topics/Topics.docx
@@ -181,6 +181,21 @@
     <w:p>
       <w:r>
         <w:t>Customs Visuals in Power BI</w:t>
+      </w:r>
+    </w:p>
+    <w:p>
+      <w:proofErr w:type="spellStart"/>
+      <w:r>
+        <w:t>Designning</w:t>
+      </w:r>
+      <w:proofErr w:type="spellEnd"/>
+      <w:r>
+        <w:t xml:space="preserve"> for Phone</w:t>
+      </w:r>
+    </w:p>
+    <w:p>
+      <w:r>
+        <w:t>Publish Dashboard in Power BI</w:t>
       </w:r>
     </w:p>
     <w:sectPr>

</xml_diff>